<commit_message>
Update primary email address
</commit_message>
<xml_diff>
--- a/public/resume/Abdulyekeen_Maadan_Resume.docx
+++ b/public/resume/Abdulyekeen_Maadan_Resume.docx
@@ -41,14 +41,7 @@
           <w:color w:val="555555"/>
           <w:sz w:val="18"/>
         </w:rPr>
-        <w:t xml:space="preserve"> · Go · AI-Au</w:t>
-      </w:r>
-      <w:r>
-        <w:rPr>
-          <w:color w:val="555555"/>
-          <w:sz w:val="18"/>
-        </w:rPr>
-        <w:t>gmented Development</w:t>
+        <w:t xml:space="preserve"> · Go · AI-Augmented Development</w:t>
       </w:r>
     </w:p>
     <w:p>
@@ -61,39 +54,74 @@
           <w:color w:val="555555"/>
           <w:sz w:val="17"/>
         </w:rPr>
-        <w:t xml:space="preserve">Lagos, Nigeria · babatundemaadan@gmail.com · </w:t>
-      </w:r>
-      <w:proofErr w:type="spellStart"/>
+        <w:t xml:space="preserve">Lagos, Nigeria · </w:t>
+      </w:r>
       <w:r>
         <w:rPr>
           <w:color w:val="555555"/>
           <w:sz w:val="17"/>
         </w:rPr>
-        <w:t>maadan.dev</w:t>
-      </w:r>
-      <w:proofErr w:type="spellEnd"/>
+        <w:t>maadan</w:t>
+      </w:r>
       <w:r>
         <w:rPr>
           <w:color w:val="555555"/>
           <w:sz w:val="17"/>
         </w:rPr>
-        <w:t xml:space="preserve"> · github.com/</w:t>
-      </w:r>
-      <w:proofErr w:type="spellStart"/>
+        <w:t>.dev</w:t>
+      </w:r>
       <w:r>
         <w:rPr>
           <w:color w:val="555555"/>
           <w:sz w:val="17"/>
         </w:rPr>
-        <w:t>Mafresh</w:t>
-      </w:r>
-      <w:proofErr w:type="spellEnd"/>
+        <w:t xml:space="preserve">@gmail.com · </w:t>
+      </w:r>
+      <w:proofErr w:type="spellStart"/>
       <w:r>
         <w:rPr>
           <w:color w:val="555555"/>
           <w:sz w:val="17"/>
         </w:rPr>
-        <w:t>-BB · linkedin.com/in/</w:t>
+        <w:t>ma</w:t>
+      </w:r>
+      <w:r>
+        <w:rPr>
+          <w:color w:val="555555"/>
+          <w:sz w:val="17"/>
+        </w:rPr>
+        <w:t>adan.dev</w:t>
+      </w:r>
+      <w:proofErr w:type="spellEnd"/>
+      <w:r>
+        <w:rPr>
+          <w:color w:val="555555"/>
+          <w:sz w:val="17"/>
+        </w:rPr>
+        <w:t xml:space="preserve"> · github.com/</w:t>
+      </w:r>
+      <w:proofErr w:type="spellStart"/>
+      <w:r>
+        <w:rPr>
+          <w:color w:val="555555"/>
+          <w:sz w:val="17"/>
+        </w:rPr>
+        <w:t>maadan</w:t>
+      </w:r>
+      <w:proofErr w:type="spellEnd"/>
+      <w:r>
+        <w:rPr>
+          <w:color w:val="555555"/>
+          <w:sz w:val="17"/>
+        </w:rPr>
+        <w:t>-dev</w:t>
+      </w:r>
+      <w:r>
+        <w:rPr>
+          <w:color w:val="555555"/>
+          <w:sz w:val="17"/>
+        </w:rPr>
+        <w:t xml:space="preserve"> · linkedin.com/in/</w:t>
       </w:r>
       <w:proofErr w:type="spellStart"/>
       <w:r>
@@ -214,8 +242,6 @@
         </w:rPr>
         <w:t>SUMMARY</w:t>
       </w:r>
-      <w:bookmarkStart w:id="0" w:name="_GoBack"/>
-      <w:bookmarkEnd w:id="0"/>
     </w:p>
     <w:p>
       <w:pPr>
@@ -326,10 +352,7 @@
       </w:r>
       <w:proofErr w:type="spellEnd"/>
       <w:r>
-        <w:t>, Go — and builds AI-augmented products using Gemini and SSE streaming pipelines. Mos</w:t>
-      </w:r>
-      <w:r>
-        <w:t xml:space="preserve">t recently launched </w:t>
+        <w:t xml:space="preserve">, Go — and builds AI-augmented products using Gemini and SSE streaming pipelines. Most recently launched </w:t>
       </w:r>
       <w:proofErr w:type="spellStart"/>
       <w:r>
@@ -489,10 +512,7 @@
       </w:r>
       <w:proofErr w:type="spellStart"/>
       <w:r>
-        <w:t>Vit</w:t>
-      </w:r>
-      <w:r>
-        <w:t>e</w:t>
+        <w:t>Vite</w:t>
       </w:r>
       <w:proofErr w:type="spellEnd"/>
       <w:r>
@@ -688,10 +708,7 @@
       </w:pPr>
       <w:proofErr w:type="spellStart"/>
       <w:r>
-        <w:t>Ne</w:t>
-      </w:r>
-      <w:r>
-        <w:t>xtRole</w:t>
+        <w:t>NextRole</w:t>
       </w:r>
       <w:proofErr w:type="spellEnd"/>
       <w:r>
@@ -742,10 +759,7 @@
         <w:ind w:hanging="158"/>
       </w:pPr>
       <w:r>
-        <w:t>Implemented SSE streaming for real-time results (~15 seconds),</w:t>
-      </w:r>
-      <w:r>
-        <w:t xml:space="preserve"> with multimodal PDF extraction </w:t>
+        <w:t xml:space="preserve">Implemented SSE streaming for real-time results (~15 seconds), with multimodal PDF extraction </w:t>
       </w:r>
       <w:proofErr w:type="spellStart"/>
       <w:r>
@@ -785,10 +799,7 @@
         <w:ind w:hanging="158"/>
       </w:pPr>
       <w:r>
-        <w:t xml:space="preserve">Gained organic traction within the first week — users sharing </w:t>
-      </w:r>
-      <w:r>
-        <w:t>the tool in WhatsApp groups unprompted.</w:t>
+        <w:t>Gained organic traction within the first week — users sharing the tool in WhatsApp groups unprompted.</w:t>
       </w:r>
     </w:p>
     <w:p>
@@ -958,10 +969,7 @@
       </w:r>
       <w:proofErr w:type="spellEnd"/>
       <w:r>
-        <w:t xml:space="preserve"> interfaces for p</w:t>
-      </w:r>
-      <w:r>
-        <w:t xml:space="preserve">aying clients across travel, non-profit, and </w:t>
+        <w:t xml:space="preserve"> interfaces for paying clients across travel, non-profit, and </w:t>
       </w:r>
       <w:proofErr w:type="spellStart"/>
       <w:r>
@@ -1138,13 +1146,7 @@
         <w:rPr>
           <w:b/>
         </w:rPr>
-        <w:t>Software Engineering Fellowship · Learn2E</w:t>
-      </w:r>
-      <w:r>
-        <w:rPr>
-          <w:b/>
-        </w:rPr>
-        <w:t xml:space="preserve">arn · June 2026 (incoming) </w:t>
+        <w:t xml:space="preserve">Software Engineering Fellowship · Learn2Earn · June 2026 (incoming) </w:t>
       </w:r>
       <w:r>
         <w:rPr>
@@ -1224,6 +1226,8 @@
         </w:rPr>
         <w:t xml:space="preserve"> in Go, algorithms, and </w:t>
       </w:r>
+      <w:bookmarkStart w:id="0" w:name="_GoBack"/>
+      <w:bookmarkEnd w:id="0"/>
       <w:proofErr w:type="gramStart"/>
       <w:r>
         <w:rPr>
@@ -1524,10 +1528,7 @@
       <w:proofErr w:type="spellEnd"/>
       <w:proofErr w:type="gramEnd"/>
       <w:r>
-        <w:t xml:space="preserve"> decomposi</w:t>
-      </w:r>
-      <w:r>
-        <w:t>tion.</w:t>
+        <w:t xml:space="preserve"> decomposition.</w:t>
       </w:r>
     </w:p>
     <w:sectPr>

</xml_diff>